<commit_message>
add to methods and tidy up
</commit_message>
<xml_diff>
--- a/Methods.docx
+++ b/Methods.docx
@@ -39,15 +39,15 @@
         <w:pStyle w:val="BodyText"/>
       </w:pPr>
       <w:r>
-        <w:t xml:space="preserve">Every spring from 1988 to 2026, we trapped female squirrels (n = 1280) repeatedly during their gestation to palpate them and track their pregnancies. When pregnant females were estimated to be within five days of their parturition date, we fit them with a very high frequency (VHF) radio collar. Once post-partum, using the VHF collar, we tracked the female to her nest. We extracted the pups from the nest to determine litter size, and individual sex and weight. We weighed individual pups to the nearest 0.1 g and gave them a unique ear notch to collect a DNA sample and identify them within the litter later. Approximately 35 days after the first visit, we re-located the nest and retrieved the pups. Now developed enough, we ear tagged the pups with unique identification codes and weighed them again to the nearest 0.1 g. To calculate juvenile growth rate, we subtracted the weight at the first visit from the weight at the second weight and divided the difference by the number of days in between visits. If a litter did not survive to its second measurement it could not be used. For this analysis we only used data from a mother’s first litter on a given year. We removed cases where the number of days in between measurements was less than 5 because pup growth is not perfectly linear. We also removed cases where the first weight was greater than 50 g or the second weight was greater than 100 g because this indicates that the nests were sampled too late after birth to be compared. We then averaged the growth rates for each litter.</w:t>
-      </w:r>
-    </w:p>
-    <w:p>
-      <w:pPr>
-        <w:pStyle w:val="BodyText"/>
-      </w:pPr>
-      <w:r>
-        <w:t xml:space="preserve">We had a total sample size of 2132 litters total. The final life history measurements were litter size (ranged from 1 to 7), litter growth rate (ranged from 0.19 to 4.62 g/day), litter sex ratio (proportion being male), litter parturition date (mean = 117 Julian Day), and mother age (mean = 3 years). If a litter’s parturition date was unknown (n = 91), e.g., the first nest visit occurred later than normal, we estimated it by subtracting the number of days from the first nest visit to when the pup size would have been the average birth weight of 8 g via the average growth rate of 1.8 g per day. If a mother’s age was unknown (n = 767), i.e., we do not have a birth record of her, we assumed it to be the year before she was first entered into the study based on trapping records.</w:t>
+        <w:t xml:space="preserve">Every spring from 1988 to 2026, we trapped female squirrels repeatedly during their gestation to palpate them and track their pregnancies. When pregnant females were estimated to be within five days of their parturition date, we fit them with a very high frequency (VHF) radio collar. Once post-partum, using the VHF collar, we tracked the female to her nest. We extracted the pups from the nest to determine litter size, and individual sex and weight. We weighed individual pups to the nearest 0.1 g and gave them a unique ear notch to collect a DNA sample and identify them within the litter later. Approximately 35 days after the first visit, we re-located the nest and retrieved the pups. Now developed enough, we ear tagged the pups with unique identification codes and weighed them again to the nearest 0.1 g. To calculate juvenile growth rate, we subtracted the weight at the first visit from the weight at the second weight and divided the difference by the number of days in between visits. If a litter did not survive to its second measurement it could not be used. For this analysis we only used data from a mother’s first litter on a given year. We removed cases where the number of days in between measurements was less than 5 because pup growth is not perfectly linear. We also removed cases where the first weight was greater than 50 g or the second weight was greater than 100 g because this indicates that the nests were sampled too late after birth to be compared. We then averaged the growth rates for each litter.</w:t>
+      </w:r>
+    </w:p>
+    <w:p>
+      <w:pPr>
+        <w:pStyle w:val="BodyText"/>
+      </w:pPr>
+      <w:r>
+        <w:t xml:space="preserve">We had a total sample size of 2132 litters from 1280 mothers. The final life history measurements were litter size, litter growth rate, litter sex ratio (proportion being male), litter parturition date (Julian Day), mother age (years), and mother birth year. If a litter’s parturition date was unknown (n = 91), e.g., the first nest visit occurred later than normal, we estimated it by subtracting the number of days from the first nest visit to when the pup size would have been the average birth weight of 8 g via the average growth rate of 1.8 g per day (i.e., birth date = date 1 - (weight 1 - 8)/1.8). If a mother’s age was unknown (n = 767), i.e., we do not have a birth record of the mother, we assumed it to be the year before she was first entered into the study.</w:t>
       </w:r>
     </w:p>
     <w:p>
@@ -79,7 +79,7 @@
         <w:pStyle w:val="BodyText"/>
       </w:pPr>
       <w:r>
-        <w:t xml:space="preserve">Natural variation in food availability was measured three different ways, the cone production during the previous year, the mast year status of the current year, and the mother’ cache size from the previous year. To assess annual cone production, we counted the number of new cones on 100 trees (average) stratified within each of the 7 study grids every August from 1988 to 2026. We log transformed the tree cone counts, and took the average for every grid every year. If a grid was not assessed on a given year, we gave it the average tree cone count of all grids measured that year (n = 58 litters). Based on cone count data, we categorized years as having normal amounts of cone production or as being mast years, when there were an exponentially high amount of cones produced that autumn (stat?). Over the course of this long term study, 1993, 1998, 2005, 2010, 2014, 2019, 2022 were the mast years. To assess squirrel cache sizes, we counted the number of cones cached on all primary middens in control grids each September starting in 2007 (probably needs more detail). We log transformed the cached cone counts and paired them to litters born the year following a mother’s midden cone count. In total, 457 litters had cache size data.</w:t>
+        <w:t xml:space="preserve">Natural variation in food availability was measured three different ways, the cone production during the previous year, the mast year status of the current year, and the mother’ cache size from the previous year. To assess annual cone production, we counted the number of new cones on 100 trees (average) stratified within each of the 7 study grids every August from 1988 to 2026. We log transformed the tree cone counts, and took the average for every grid every year. If a grid was not assessed on a given year, we gave it the average tree cone count of all grids measured that year (n = 58 litters). Based on cone count data, we categorized years as having normal amounts of cone production or as being mast years, when there were an exponentially high amount of cones produced that autumn (stat?). Over the course of this long term study, 1993, 1998, 2005, 2010, 2014, 2019, 2022 were the mast years. To assess squirrel cache sizes, we counted the number of cones cached on all primary middens in control grids each September starting in 2007 (probably needs more detail). We log transformed the cached cone counts and paired them to litters born the year following a mother’s midden cone count. In total, 457 litters had associated cache sizes.</w:t>
       </w:r>
     </w:p>
     <w:p>
@@ -95,7 +95,7 @@
         <w:pStyle w:val="BodyText"/>
       </w:pPr>
       <w:r>
-        <w:t xml:space="preserve">In order to test if higher densities affected squirrels non-directly, we experimentally manipulate squirrel perception of density by playing recordings of squirrel rattles to a subset of squirrels. The playback experiments were conducted from 2018 to 2022 on one grid, in addition to a pilot study in 2010 that occurred on three grids. On each grid, speakers were deployed at an average density of XX per ha and were programmed to play squirrel rattles every XX minutes. (more detailed required I assume).</w:t>
+        <w:t xml:space="preserve">In order to test if higher densities affected squirrels non-directly, we experimentally manipulate squirrel perception of density by playing recordings of squirrel rattles to a subset of squirrels. The playback experiments were conducted from 2018 to 2022 on one grid, in addition to a pilot study in 2010 that occurred on three grids. On each grid, speakers were deployed at an average density of XX per ha and were programmed to play squirrel rattles every XX minutes. (I can’t speak to much to the actual methods here obviously). In total, 59 mothers and 65 litters were from rattle playback grids, while 147 mothers and 160 litters were from control grids during those same years.</w:t>
       </w:r>
     </w:p>
     <w:p>
@@ -111,15 +111,15 @@
         <w:pStyle w:val="BodyText"/>
       </w:pPr>
       <w:r>
-        <w:t xml:space="preserve">We used the long term census and trapping data to calculate the local density (squirrels per hectare) experienced by each mother every spring.</w:t>
-      </w:r>
-    </w:p>
-    <w:p>
-      <w:pPr>
-        <w:pStyle w:val="BodyText"/>
-      </w:pPr>
-      <w:r>
-        <w:t xml:space="preserve">BiTo do this, we tallied the number of squirrels who lived within a 130 m radius of every occupied midden on a grid each year (See example in Fig XX) and divided this count by the circle area, or 5.31 hectares. Grid edges naturally had lower densities because grids were surrounded by unusable habitat, such as marshes, aspen forests, or the Alaska highway. Therefore, we did not have to extrapolate squirrel densities outside of grid boundaries. Food supplementation caused an increase in local density over time, with the average local density on Agnes grid increasing at a rate of 0.13 squirrels/ha every year over the 12 years of its food experiment. Over the entire study, squirrels on food supplemented grids experienced higher local densities, with an average of 2.44 squirrels/ha, compared to those on control grids, that had on average 2.05 squirrels/ha.</w:t>
+        <w:t xml:space="preserve">To estimate local densities (squirrels/ha) experienced by mothers in spring, we used the long term census data from the Kluane Red Squirrel Project. Trapping grids were censused every spring in May to determine midden locations and ownership. A squirrel was considered the owner of a midden if it was regularly trapped there and displayed territorial behaviours while on the midden (e.g., rattles). We collected all known squirrels and their midden locations (x, y coordinates) from all years of the spring census data. Occasionally, squirrels may own multiple middens; in these scenarios, we only used the squirrel’s primary midden. In total, there were 12331 census records of 5128 known squirrels, across the 7 grids and over the 38 year study. There were 301 census records that had a known squirrel but were missing a location. In these cases, we used the average trapping location of that squirrel that spring (April - June) as their census location.</w:t>
+      </w:r>
+    </w:p>
+    <w:p>
+      <w:pPr>
+        <w:pStyle w:val="BodyText"/>
+      </w:pPr>
+      <w:r>
+        <w:t xml:space="preserve">To calculate local density for each mother, we counted how squirrels resided within a 130 m radius of her midden location (see figure S1 for a visual example of real spatial locations) and divided this count by the circle area, or 5.3 hectares. The edges of trapping grids naturally had lower squirrel densities because grids were surrounded by habitat unsuitable for squirrels, such as marshes, aspen forests, or the Alaska highway. Therefore, we did not extrapolate squirrel densities outside of grid boundaries. Food supplementation caused an increase in local density over time.</w:t>
       </w:r>
     </w:p>
     <w:p>
@@ -135,23 +135,86 @@
         <w:pStyle w:val="BodyText"/>
       </w:pPr>
       <w:r>
-        <w:t xml:space="preserve">We standardized all numeric independent variables. Local density, cone density, and cache size were all standardized within years, while Julian birth date and mother age were standardized within grid-year. We categorized squirrels into one of four treatment groups: controls, food adds with a bucket (henceforth, ‘bucket’), food add without a bucket (henceforth, ‘no bucket’), and rattle playbacks (henceforth, ‘rattle’). To assess how the covariance between litter size and juvenile growth rate is affected by food availability, density, and perceived density, we conducted bivariate response analyses using a Bayesian framework. To coherently meet the objectives of this study, we conducted three separate analyses using different subsets of the data. All data cleaning and statistical analyses were conducted using R language software (cite version). Bayesian analyses were conducted using the ‘brms’ package (cite).</w:t>
-      </w:r>
-    </w:p>
-    <w:p>
-      <w:pPr>
-        <w:pStyle w:val="BodyText"/>
-      </w:pPr>
-      <w:r>
-        <w:t xml:space="preserve">To test how food supplementation affected the relationship between juvenile growth rates and litter size in response to density and natural food availability, our first analysis used only data from the control and food add grids across all years of the study. This dataset therefore had three treatment groups: control, bucket, and no bucket.</w:t>
-      </w:r>
-    </w:p>
-    <w:p>
-      <w:pPr>
-        <w:pStyle w:val="BodyText"/>
-      </w:pPr>
-      <w:r>
-        <w:t xml:space="preserve">To assess the impact of The second analysis used data from control grids only,</w:t>
+        <w:t xml:space="preserve">All data cleaning and statistical analyses were conducted using R language software (cite version). We standardized all numeric variables. Local density, tree cone density, cache size, and mother age were all standardized across all years and all grids. Litter size, litter growth rate, and Julian birth date were standardized within grid-year. Using the standardized cache size data, we categorized litters into three cache size levels: small (&lt; 25% quantile), medium (&gt; 25% and &lt; 75% quantile), and large (&gt; 75% quantile). Years were categorized as either mast years or regular years. We categorized litters into one of four treatment groups: controls, food adds with a bucket (henceforth, ‘bucket’), food add without a bucket (henceforth, ‘no bucket’), and rattle playbacks (henceforth, ‘rattle’).</w:t>
+      </w:r>
+    </w:p>
+    <w:p>
+      <w:pPr>
+        <w:pStyle w:val="BodyText"/>
+      </w:pPr>
+      <w:r>
+        <w:t xml:space="preserve">To test how food availability and perceived density influence the relationship between litter size and growth rate in response to con-specific density, we used a multivariate Bayesian framework. To coherently meet the objectives of this study, we conducted three separate multivate Bayesian models using the ‘brms’ package (cite). Using the bf() function, we created two model formulas per analysis, one for each response variable, i.e., litter size and litter growth rate. We ran the models using the brm() function, merging both models into a bivariate analysis using the</w:t>
+      </w:r>
+      <w:r>
+        <w:t xml:space="preserve"> </w:t>
+      </w:r>
+      <w:r>
+        <w:t xml:space="preserve">‘formula =’</w:t>
+      </w:r>
+      <w:r>
+        <w:t xml:space="preserve"> </w:t>
+      </w:r>
+      <w:r>
+        <w:t xml:space="preserve">argument. We ran each model with 2 cores and 2 chains, using 1000 warm up and 10^{4} iterations total. Analyses differed in what data was included and what categorical variable interacted with local density. However, all models included tree cone counts, mother age, mother age squared, parturition date, mast year, and litter sex ratio as fixed effects and grid-year and mother birth year as random effects.</w:t>
+      </w:r>
+    </w:p>
+    <w:p>
+      <w:pPr>
+        <w:pStyle w:val="BodyText"/>
+      </w:pPr>
+      <w:r>
+        <w:t xml:space="preserve">The first analysis, called the</w:t>
+      </w:r>
+      <w:r>
+        <w:t xml:space="preserve"> </w:t>
+      </w:r>
+      <w:r>
+        <w:t xml:space="preserve">‘Food Model’</w:t>
+      </w:r>
+      <w:r>
+        <w:t xml:space="preserve">, tested how food supplementation affected the relationship between litter size and growth rates in response to density. The Food Model used litters from control and food add grids across all years of the study (n = 1987). This data set therefore had three individual treatment groups: control, bucket, and no bucket. We interacted food treatment with density. No other fixed effects interacted.</w:t>
+      </w:r>
+    </w:p>
+    <w:p>
+      <w:pPr>
+        <w:pStyle w:val="BodyText"/>
+      </w:pPr>
+      <w:r>
+        <w:t xml:space="preserve">The second analysis, called the</w:t>
+      </w:r>
+      <w:r>
+        <w:t xml:space="preserve"> </w:t>
+      </w:r>
+      <w:r>
+        <w:t xml:space="preserve">‘Cache Model’</w:t>
+      </w:r>
+      <w:r>
+        <w:t xml:space="preserve">, tested how the mother’s cache size affected the relationship between litter size and growth rates in response to density. The Cache Model used litters from control grids during years when midden cones were counted (n = 457). This data set therefore had three cache size categories: small, medium, and large. We interacted cache size with density. No other fixed effects interacted.</w:t>
+      </w:r>
+    </w:p>
+    <w:p>
+      <w:pPr>
+        <w:pStyle w:val="BodyText"/>
+      </w:pPr>
+      <w:r>
+        <w:t xml:space="preserve">The third analysis, called the</w:t>
+      </w:r>
+      <w:r>
+        <w:t xml:space="preserve"> </w:t>
+      </w:r>
+      <w:r>
+        <w:t xml:space="preserve">‘Rattle Model’</w:t>
+      </w:r>
+      <w:r>
+        <w:t xml:space="preserve">, tested how changes in perceived density, via rattle playbacks, affected the relationship between litter size and growth rates in response to density. The Rattle Model used litters from control and rattle grids during years when playback experiments occurred (n = 236). This data set therefore had two treatments: rattles and controls. We interacted treatment with density. No other fixed effects interacted.</w:t>
+      </w:r>
+    </w:p>
+    <w:p>
+      <w:pPr>
+        <w:pStyle w:val="BodyText"/>
+      </w:pPr>
+      <w:r>
+        <w:t xml:space="preserve">… more details needed around what stats we actually extract etc. I figured this can wait.</w:t>
       </w:r>
     </w:p>
     <w:sectPr>

</xml_diff>

<commit_message>
Edits based on ben's comments
</commit_message>
<xml_diff>
--- a/Methods.docx
+++ b/Methods.docx
@@ -39,15 +39,15 @@
         <w:pStyle w:val="BodyText"/>
       </w:pPr>
       <w:r>
-        <w:t xml:space="preserve">Every spring from 1988 to 2026, we trapped female squirrels repeatedly during their gestation to palpate them and track their pregnancies. When pregnant females were estimated to be within five days of their parturition date, we fit them with a very high frequency (VHF) radio collar. Once post-partum, using the VHF collar, we tracked the female to her nest. We extracted the pups from the nest to determine litter size, and individual sex and weight. We weighed individual pups to the nearest 0.1 g and gave them a unique ear notch to collect a DNA sample and identify them within the litter later. Approximately 35 days after the first visit, we re-located the nest and retrieved the pups. Now developed enough, we ear tagged the pups with unique identification codes and weighed them again to the nearest 0.1 g. To calculate juvenile growth rate, we subtracted the weight at the first visit from the weight at the second weight and divided the difference by the number of days in between visits. If a litter did not survive to its second measurement it could not be used. For this analysis we only used data from a mother’s first litter on a given year. We removed cases where the number of days in between measurements was less than 5 because pup growth is not perfectly linear. We also removed cases where the first weight was greater than 50 g or the second weight was greater than 100 g because this indicates that the nests were sampled too late after birth to be compared. We then averaged the growth rates for each litter.</w:t>
-      </w:r>
-    </w:p>
-    <w:p>
-      <w:pPr>
-        <w:pStyle w:val="BodyText"/>
-      </w:pPr>
-      <w:r>
-        <w:t xml:space="preserve">We had a total sample size of 2132 litters from 1280 mothers. The final life history measurements were litter size, litter growth rate, litter sex ratio (proportion being male), litter parturition date (Julian Day), mother age (years), and mother birth year. If a litter’s parturition date was unknown (n = 91), e.g., the first nest visit occurred later than normal, we estimated it by subtracting the number of days from the first nest visit to when the pup size would have been the average birth weight of 8 g via the average growth rate of 1.8 g per day (i.e., birth date = date 1 - (weight 1 - 8)/1.8). If a mother’s age was unknown (n = 767), i.e., we do not have a birth record of the mother, we assumed it to be the year before she was first entered into the study.</w:t>
+        <w:t xml:space="preserve">Every spring from 1989 to 2025, we trapped female squirrels repeatedly during pregnancy to palpate them and track their pregnancies up to and following gestation. When pregnant females were estimated to be within five days of their parturition date, we fitted them with a very high frequency (VHF) radio collar. Once post-partum (parturition identified by large body mass loss or expressing milk from nipples), using the VHF collar, we tracked the female to her nest. We extracted the pups from the nest to determine litter size, and individual sex and weight. We weighed individual pups to the nearest 0.1 g and gave them a unique ear notch to later identify them within the litter and collect a tissue sample for subsequent DNA parentage analyses (REF). Approximately 25 days after the first visit, we re-located the nest and retrieved the pups. Now developed enough, we ear tagged the pups with unique identification codes and weighed them again to the nearest 0.1 g. To calculate juvenile growth rate, we subtracted the weight at the first visit from the weight at the second weight and divided the difference by the number of days in between visits. Juvenile growth during this time period is linear (REF McAdam &amp; Boutin, 2003 J Evol Biol). SOme litters did not survive to the second nest entry, so we could not obtain growth rates for all litters. For this analysis we only used data from a mother’s first litter on a given year to be consistent with previous studies (REF). We removed cases where the number of days in between weight measurements was less than 5, the first weight was greater than 50 g, or the second weight was greater than 100 g because these are characteristics of instances when a nest was initially sampled too late after parturition to be compared. We then averaged the growth rates for each litter so that each female had only one litter averaged growth rate per year.</w:t>
+      </w:r>
+    </w:p>
+    <w:p>
+      <w:pPr>
+        <w:pStyle w:val="BodyText"/>
+      </w:pPr>
+      <w:r>
+        <w:t xml:space="preserve">We had a total sample size of 2132 litters from 1280 mothers collected from squirrels on two adjacent study areas from 1989-2025. We also collected the parturition dates of all litters because litters born later in the year are usually smaller in size and growth rate (REF). If a litter’s parturition date was unknown (n = 91), e.g., the first nest visit occurred later than normal, we estimated it by subtracting the number of days from the first nest visit to when the pup size would have been the average birth weight of 8 g via the average growth rate of 1.8 g per day (i.e., birth date = date 1 - (weight 1 - 8)/1.8) (REF). Mother age and birth year can also influence life history outcomes (REF). Therefore, we also collected the mothers’ birth years from the study’s birth record data. If a mother’s birth year was unknown (n = 490 out of 1280 total mothers), i.e., we do not have a birth record of the mother, we assumed it to be the year before she was first entered into the study. The final life history measurements were litter size, litter growth rate, litter sex ratio (proportion being male), litter parturition date (Julian Day), mother age (years), and mother birth year.</w:t>
       </w:r>
     </w:p>
     <w:p>
@@ -63,7 +63,7 @@
         <w:pStyle w:val="BodyText"/>
       </w:pPr>
       <w:r>
-        <w:t xml:space="preserve">Food supplementation started in 2005 and continued until 2017, occurring on 3 grids (LL, JO, AG). Within the food add grids, buckets of peanut butter were distributed to some middens randomly. These buckets were frequently restocked with peanut butter, to make the food add as close to ad libitum as possible. Natural defensive behaviour by squirrels ensured that buckets were only accessed by the owners of the midden. In total, 470 mothers and 777 litters were from food add grids, with 319 mothers and 479 litters being from middens with buckets. The remainder were from food add grids but did not receive direct food supplementation.</w:t>
+        <w:t xml:space="preserve">Food supplementation (i.e., food add) occurred on three separate areas (LL, JO, AG) that were distant from the other two control study areas (KL/SU). Food add experiments started in the Autumn of 2005 and continued until Spring of 2017, though the exact start and end dates of the food supplementation varied by study area (Table SX). Within the food add areas, buckets containing approximately 1 KG of peanut butter were distributed to squirrel middens randomly. These buckets were restocked with peanut butter approximately every 6 weeks from autumn to spring and/or until females were no longer lactating to the food add as close to ad libitum as possible. Natural defensive behaviour by squirrels ensured that buckets were only accessed by the owners of the midden (REF van Kesteren et al. 2019 PBZ). In total, 470 mothers and 777 litters were from food add areas, with 319 mothers and 479 litters being from middens with buckets. The remainder were from food add areas but did not receive direct food supplementation.</w:t>
       </w:r>
     </w:p>
     <w:p>
@@ -79,7 +79,41 @@
         <w:pStyle w:val="BodyText"/>
       </w:pPr>
       <w:r>
-        <w:t xml:space="preserve">Natural variation in food availability was measured three different ways, the cone production during the previous year, the mast year status of the current year, and the mother’ cache size from the previous year. To assess annual cone production, we counted the number of new cones on 100 trees (average) stratified within each of the 7 study grids every August from 1988 to 2026. We log transformed the tree cone counts, and took the average for every grid every year. If a grid was not assessed on a given year, we gave it the average tree cone count of all grids measured that year (n = 58 litters). Based on cone count data, we categorized years as having normal amounts of cone production or as being mast years, when there were an exponentially high amount of cones produced that autumn (stat?). Over the course of this long term study, 1993, 1998, 2005, 2010, 2014, 2019, 2022 were the mast years. To assess squirrel cache sizes, we counted the number of cones cached on all primary middens in control grids each September starting in 2007 (probably needs more detail). We log transformed the cached cone counts and paired them to litters born the year following a mother’s midden cone count. In total, 457 litters had associated cache sizes.</w:t>
+        <w:t xml:space="preserve">Natural variation in food availability was measured three different ways, the cone production during the previous year, the spruce mast year status of the current year, and the mother’s spruce cone cache size from the previous year. To assess annual cone production, we used a standardized procedure (ref) where we used binoculars to count the number of new cones on around 100 spruce trees systematically distributed across each study are for each of the 7 study areas in in the late summer before squirrels started clipping and caching the cones (typically late July or early August) from 1989 to 2025. We log transformed the tree cone counts and took the average for every grid every year (REF LaMontagne and Boutin 2007). There were 4 cases where we did not quantify the spruce cone production on a study area in a given year. In such cases, we gave it the study area the average tree cone production of all the study areas measured that year. Based on cone count data, we categorized years as being</w:t>
+      </w:r>
+      <w:r>
+        <w:t xml:space="preserve"> </w:t>
+      </w:r>
+      <w:r>
+        <w:t xml:space="preserve">‘non-mast years’</w:t>
+      </w:r>
+      <w:r>
+        <w:t xml:space="preserve">, i.e., having typical amounts of cone production, or as being</w:t>
+      </w:r>
+      <w:r>
+        <w:t xml:space="preserve"> </w:t>
+      </w:r>
+      <w:r>
+        <w:t xml:space="preserve">‘mast years’</w:t>
+      </w:r>
+      <w:r>
+        <w:t xml:space="preserve">, when there were an exponentially high amount of cones produced that autumn (stat?). Over the course of this long-term study, we categorized 1993, 1998, 2005, 2010, 2014, 2019, 2022 as mast years.</w:t>
+      </w:r>
+    </w:p>
+    <w:p>
+      <w:pPr>
+        <w:pStyle w:val="BodyText"/>
+      </w:pPr>
+      <w:r>
+        <w:t xml:space="preserve">To assess spruce cone cache sizes of individual squirrels, we used a standardized method to count the number of cones cached on middens owned by squirrels on the two control study areas (KL/SU) each September starting in 2007 (probably needs more detail, REF Haines et al. 2022). We log transformed the cached cone counts and paired them to litters born the year following a mother’s midden cone count. In total, 457 litters from 284 females had associated cache sizes.</w:t>
+      </w:r>
+    </w:p>
+    <w:p>
+      <w:pPr>
+        <w:pStyle w:val="BodyText"/>
+      </w:pPr>
+      <w:r>
+        <w:t xml:space="preserve">END OF EDITS FROM BEN. CONTINIUE EDITING HERE:</w:t>
       </w:r>
     </w:p>
     <w:p>

</xml_diff>

<commit_message>
incorporate more comments from Ben
</commit_message>
<xml_diff>
--- a/Methods.docx
+++ b/Methods.docx
@@ -113,14 +113,6 @@
         <w:pStyle w:val="BodyText"/>
       </w:pPr>
       <w:r>
-        <w:t xml:space="preserve">END OF EDITS FROM BEN. CONTINIUE EDITING HERE:</w:t>
-      </w:r>
-    </w:p>
-    <w:p>
-      <w:pPr>
-        <w:pStyle w:val="BodyText"/>
-      </w:pPr>
-      <w:r>
         <w:t xml:space="preserve">Rattle Playback Experiment</w:t>
       </w:r>
     </w:p>
@@ -129,7 +121,7 @@
         <w:pStyle w:val="BodyText"/>
       </w:pPr>
       <w:r>
-        <w:t xml:space="preserve">In order to test if higher densities affected squirrels non-directly, we experimentally manipulate squirrel perception of density by playing recordings of squirrel rattles to a subset of squirrels. The playback experiments were conducted from 2018 to 2022 on one grid, in addition to a pilot study in 2010 that occurred on three grids. On each grid, speakers were deployed at an average density of XX per ha and were programmed to play squirrel rattles every XX minutes. (I can’t speak to much to the actual methods here obviously). In total, 59 mothers and 65 litters were from rattle playback grids, while 147 mothers and 160 litters were from control grids during those same years.</w:t>
+        <w:t xml:space="preserve">Food and density are inherently correlated with one another in this system (REF Dantzer et al., 2020). To test whether acoustic cues of higher squirrel densities without additional food affected the life history traits of squirrels, we experimentally manipulated acoustic densities of squirrels by exposing them to recordings of squirrel rattles on four study areas over six years. The playback experiments were conducted from 2018 to 2022 on one grid, in addition to a separate study in 2010 that occurred on three grids (Dantzer et al. 2013). On each grid, speakers were deployed at an average density of XX per ha and were programmed to play squirrel rattles every XX minutes. In total, 59 mothers and 65 litters were from rattle playback grids, while 147 mothers and 160 litters were from control grids during those same years (2010 and 2018-2022).</w:t>
       </w:r>
     </w:p>
     <w:p>
@@ -145,15 +137,15 @@
         <w:pStyle w:val="BodyText"/>
       </w:pPr>
       <w:r>
-        <w:t xml:space="preserve">To estimate local densities (squirrels/ha) experienced by mothers in spring, we used the long term census data from the Kluane Red Squirrel Project. Trapping grids were censused every spring in May to determine midden locations and ownership. A squirrel was considered the owner of a midden if it was regularly trapped there and displayed territorial behaviours while on the midden (e.g., rattles). We collected all known squirrels and their midden locations (x, y coordinates) from all years of the spring census data. Occasionally, squirrels may own multiple middens; in these scenarios, we only used the squirrel’s primary midden. In total, there were 12331 census records of 5128 known squirrels, across the 7 grids and over the 38 year study. There were 301 census records that had a known squirrel but were missing a location. In these cases, we used the average trapping location of that squirrel that spring (April - June) as their census location.</w:t>
-      </w:r>
-    </w:p>
-    <w:p>
-      <w:pPr>
-        <w:pStyle w:val="BodyText"/>
-      </w:pPr>
-      <w:r>
-        <w:t xml:space="preserve">To calculate local density for each mother, we counted how squirrels resided within a 130 m radius of her midden location (see figure S1 for a visual example of real spatial locations) and divided this count by the circle area, or 5.3 hectares. The edges of trapping grids naturally had lower squirrel densities because grids were surrounded by habitat unsuitable for squirrels, such as marshes, aspen forests, or the Alaska highway. Therefore, we did not extrapolate squirrel densities outside of grid boundaries. Food supplementation caused an increase in local density over time.</w:t>
+        <w:t xml:space="preserve">To estimate conspecific densities (squirrels/ha) that breeding females experienced, we identified the total number of squirrels defending a territory each spring in May of each year. A squirrel was considered the owner of a midden if it was regularly trapped there and displayed territorial behaviours while on the midden (e.g., rattles or caching spruce cones at the midden). Because squirrels are diurnal, visually/acoustically conspicuous, and easily live-trapped, we were able to completely enumerate all squirrels on the study areas. Occasionally, squirrels may own multiple middens; in these scenarios, we only used the squirrel’s primary midden, which was defined as the location where the squirrel most often occurred (observed or captured at that location) and where its spruce cone cache was located. In total, there were 12331 census records of 5128 known squirrels, across the 7 grids and over the 38 year study. There were 301 census records that had a known squirrel but were missing a location. In these cases, we used the average trapping location of that squirrel that spring (April - June) as their census location.</w:t>
+      </w:r>
+    </w:p>
+    <w:p>
+      <w:pPr>
+        <w:pStyle w:val="BodyText"/>
+      </w:pPr>
+      <w:r>
+        <w:t xml:space="preserve">To calculate local density for each mother, we counted how many squirrels resided within a 130 m radius of her midden location (see figure S1 for a visual example of real spatial locations) and divided this count by the circle area, or 5.3 hectares. We chose this 130 m radius as this is likely the farthest distance that squirrels can hear the territorial vocalizations of other squirrels (REF Smith, 1968, 1978) and it has proven to be an ecologically-relevant estimate of the acoustic neighborhood experienced red squirrels that influences their life history traits (REF Fisher et al., 2017; Siracusa et al., 2021). The edges of trapping grids naturally had lower squirrel densities because grids were surrounded by habitat unsuitable for squirrels, such as marshes, aspen forests, or the Alaska highway (REF Martinig et al. 2020). Therefore, we did not extrapolate squirrel densities outside of grid boundaries. Food supplementation caused an increase in local density over time.</w:t>
       </w:r>
     </w:p>
     <w:p>
@@ -169,27 +161,45 @@
         <w:pStyle w:val="BodyText"/>
       </w:pPr>
       <w:r>
-        <w:t xml:space="preserve">All data cleaning and statistical analyses were conducted using R language software (cite version). We standardized all numeric variables. Local density, tree cone density, cache size, and mother age were all standardized across all years and all grids. Litter size, litter growth rate, and Julian birth date were standardized within grid-year. Using the standardized cache size data, we categorized litters into three cache size levels: small (&lt; 25% quantile), medium (&gt; 25% and &lt; 75% quantile), and large (&gt; 75% quantile). Years were categorized as either mast years or regular years. We categorized litters into one of four treatment groups: controls, food adds with a bucket (henceforth, ‘bucket’), food add without a bucket (henceforth, ‘no bucket’), and rattle playbacks (henceforth, ‘rattle’).</w:t>
-      </w:r>
-    </w:p>
-    <w:p>
-      <w:pPr>
-        <w:pStyle w:val="BodyText"/>
-      </w:pPr>
-      <w:r>
-        <w:t xml:space="preserve">To test how food availability and perceived density influence the relationship between litter size and growth rate in response to con-specific density, we used a multivariate Bayesian framework. To coherently meet the objectives of this study, we conducted three separate multivate Bayesian models using the ‘brms’ package (cite). Using the bf() function, we created two model formulas per analysis, one for each response variable, i.e., litter size and litter growth rate. We ran the models using the brm() function, merging both models into a bivariate analysis using the</w:t>
+        <w:t xml:space="preserve">All data cleaning and statistical analyses were conducted using R language software (REF version). We standardized all numeric variables to have a mean of zero and a standard deviation of 1. Local density, spruce cone production, cache size, and mother age were all standardized across all years and all grids. Litter size, litter growth rate, and Julian birth date were standardized within grid-year to be consistent with other studies (REF McAdam et al., 2019, etc.). Using the standardized cache size data, we categorized litters into three levels: small (&lt; 25% quantile), medium (&gt; 25% and &lt; 75% quantile), and large (&gt; 75% quantile). Years were categorized as either mast years or non-mast years, as indicated above. We categorized litters into one of four treatment groups: 1) controls, 2) high density with supplemental food food (henceforth,</w:t>
       </w:r>
       <w:r>
         <w:t xml:space="preserve"> </w:t>
       </w:r>
       <w:r>
-        <w:t xml:space="preserve">‘formula =’</w:t>
+        <w:t xml:space="preserve">‘bucket’</w:t>
+      </w:r>
+      <w:r>
+        <w:t xml:space="preserve">), 3) high density without food (henceforth</w:t>
       </w:r>
       <w:r>
         <w:t xml:space="preserve"> </w:t>
       </w:r>
       <w:r>
-        <w:t xml:space="preserve">argument. We ran each model with 2 cores and 2 chains, using 1000 warm up and 10^{4} iterations total. Analyses differed in what data was included and what categorical variable interacted with local density. However, all models included tree cone counts, mother age, mother age squared, parturition date, mast year, and litter sex ratio as fixed effects and grid-year and mother birth year as random effects.</w:t>
+        <w:t xml:space="preserve">‘no bucket’</w:t>
+      </w:r>
+      <w:r>
+        <w:t xml:space="preserve">), and high acoustic density (henceforth, ‘rattle’).</w:t>
+      </w:r>
+    </w:p>
+    <w:p>
+      <w:pPr>
+        <w:pStyle w:val="BodyText"/>
+      </w:pPr>
+      <w:r>
+        <w:t xml:space="preserve">We used a multivariate Bayesian approach to test how food availability and perceived density influence the relationship between litter size and growth rate in response to con-specific density. To coherently meet the objectives of this study, we conducted three separate multivariate Bayesian models using the ‘brms’ package (cite). Using the bf() function, we created two model formulas per analysis, one for each response variable, i.e., litter size and litter growth rate. We ran the models using the brm() function, merging both models into a bivariate analysis using the</w:t>
+      </w:r>
+      <w:r>
+        <w:t xml:space="preserve"> </w:t>
+      </w:r>
+      <w:r>
+        <w:t xml:space="preserve">‘formula’</w:t>
+      </w:r>
+      <w:r>
+        <w:t xml:space="preserve"> </w:t>
+      </w:r>
+      <w:r>
+        <w:t xml:space="preserve">argument. We ran each model with 2 cores and 2 chains, using 1000 warm up and 10^{4} iterations total. Analyses differed in what data was included and what categorical variable interacted with local density. However, all models included spruce cone production, mother age, mother age squared, parturition date, mast year, and litter sex ratio as fixed effects and grid-year and mother birth year as random effects.</w:t>
       </w:r>
     </w:p>
     <w:p>
@@ -203,18 +213,35 @@
         <w:t xml:space="preserve"> </w:t>
       </w:r>
       <w:r>
+        <w:t xml:space="preserve">‘Control Model’</w:t>
+      </w:r>
+      <w:r>
+        <w:t xml:space="preserve">, tested how, under natural food and natural density conditions, the relationship between litter size and litter growth rate is affected by local density. The control model used litters from control grids (KL and SU) across all years of the long-term study (1989 - 2025) and included all fixed and random effects listed above.</w:t>
+      </w:r>
+    </w:p>
+    <w:p>
+      <w:pPr>
+        <w:pStyle w:val="BodyText"/>
+      </w:pPr>
+      <w:r>
+        <w:t xml:space="preserve">The second analysis, called the</w:t>
+      </w:r>
+      <w:r>
+        <w:t xml:space="preserve"> </w:t>
+      </w:r>
+      <w:r>
         <w:t xml:space="preserve">‘Food Model’</w:t>
       </w:r>
       <w:r>
-        <w:t xml:space="preserve">, tested how food supplementation affected the relationship between litter size and growth rates in response to density. The Food Model used litters from control and food add grids across all years of the study (n = 1987). This data set therefore had three individual treatment groups: control, bucket, and no bucket. We interacted food treatment with density. No other fixed effects interacted.</w:t>
-      </w:r>
-    </w:p>
-    <w:p>
-      <w:pPr>
-        <w:pStyle w:val="BodyText"/>
-      </w:pPr>
-      <w:r>
-        <w:t xml:space="preserve">The second analysis, called the</w:t>
+        <w:t xml:space="preserve">, tested how food supplementation affected the relationship between litter size and growth rates in response to density. The Food Model used litters from control and food add grids across all years of the food add experiment (2005 to 2017, n = 1260). This data set therefore had three individual treatment groups: control, bucket, and no bucket. We interacted food treatment with density.</w:t>
+      </w:r>
+    </w:p>
+    <w:p>
+      <w:pPr>
+        <w:pStyle w:val="BodyText"/>
+      </w:pPr>
+      <w:r>
+        <w:t xml:space="preserve">The third analysis, called the</w:t>
       </w:r>
       <w:r>
         <w:t xml:space="preserve"> </w:t>
@@ -223,15 +250,15 @@
         <w:t xml:space="preserve">‘Cache Model’</w:t>
       </w:r>
       <w:r>
-        <w:t xml:space="preserve">, tested how the mother’s cache size affected the relationship between litter size and growth rates in response to density. The Cache Model used litters from control grids during years when midden cones were counted (n = 457). This data set therefore had three cache size categories: small, medium, and large. We interacted cache size with density. No other fixed effects interacted.</w:t>
-      </w:r>
-    </w:p>
-    <w:p>
-      <w:pPr>
-        <w:pStyle w:val="BodyText"/>
-      </w:pPr>
-      <w:r>
-        <w:t xml:space="preserve">The third analysis, called the</w:t>
+        <w:t xml:space="preserve">, tested how the mother’s categorized cache size (3 levels) affected the relationship between litter size and growth rates in response to density. The Cache Model used litters from control grids during years when midden cones were counted (2008 to 2025, n = 457). We interacted cache size with density. No other fixed effects interacted.</w:t>
+      </w:r>
+    </w:p>
+    <w:p>
+      <w:pPr>
+        <w:pStyle w:val="BodyText"/>
+      </w:pPr>
+      <w:r>
+        <w:t xml:space="preserve">The fourth and final analysis, called the</w:t>
       </w:r>
       <w:r>
         <w:t xml:space="preserve"> </w:t>
@@ -240,7 +267,7 @@
         <w:t xml:space="preserve">‘Rattle Model’</w:t>
       </w:r>
       <w:r>
-        <w:t xml:space="preserve">, tested how changes in perceived density, via rattle playbacks, affected the relationship between litter size and growth rates in response to density. The Rattle Model used litters from control and rattle grids during years when playback experiments occurred (n = 236). This data set therefore had two treatments: rattles and controls. We interacted treatment with density. No other fixed effects interacted.</w:t>
+        <w:t xml:space="preserve">, tested how changes in perceived density, via rattle playbacks, affected the relationship between litter size and growth rates in response to density. The Rattle Model used litters from control and rattle grids during years when playback experiments occurred (2010 and 2010 to 2022, n = 236). This data set therefore had two treatments: rattles and controls. We interacted treatment with density. No other fixed effects interacted.</w:t>
       </w:r>
     </w:p>
     <w:p>

</xml_diff>

<commit_message>
update with ben's preferred wording
</commit_message>
<xml_diff>
--- a/Methods.docx
+++ b/Methods.docx
@@ -63,7 +63,7 @@
         <w:pStyle w:val="BodyText"/>
       </w:pPr>
       <w:r>
-        <w:t xml:space="preserve">Food supplementation (i.e., food add) occurred on three separate areas (LL, JO, AG) that were distant from the other two control study areas (KL/SU). Food add experiments started in the Autumn of 2005 and continued until Spring of 2017, though the exact start and end dates of the food supplementation varied by study area (Table SX). Within the food add areas, buckets containing approximately 1 KG of peanut butter were distributed to squirrel middens randomly. These buckets were restocked with peanut butter approximately every 6 weeks from autumn to spring and/or until females were no longer lactating to the food add as close to ad libitum as possible. Natural defensive behaviour by squirrels ensured that buckets were only accessed by the owners of the midden (REF van Kesteren et al. 2019 PBZ). In total, 470 mothers and 777 litters were from food add areas, with 319 mothers and 479 litters being from middens with buckets. The remainder were from food add areas but did not receive direct food supplementation.</w:t>
+        <w:t xml:space="preserve">Food supplementation (i.e., food add) occurred on three separate areas (LL, JO, AG) that were distant from the other two control study areas (KL/SU). Food add experiments started in the Autumn of 2005 and continued until Spring of 2017, though the exact start and end dates of the food supplementation varied by study area (Table 1). Within the food add areas, buckets containing approximately 1 KG of peanut butter were distributed to squirrel middens randomly. These buckets were restocked with peanut butter approximately every 6 weeks from autumn to spring and/or until females were no longer lactating to the food add as close to ad libitum as possible. Natural defensive behaviour by squirrels ensured that buckets were only accessed by the owners of the midden (REF van Kesteren et al. 2019 PBZ). In total, 470 mothers and 777 litters were from food add areas, with 319 mothers and 479 litters being from middens with buckets. The remainder were from food add areas but did not receive direct food supplementation.</w:t>
       </w:r>
     </w:p>
     <w:p>
@@ -79,7 +79,7 @@
         <w:pStyle w:val="BodyText"/>
       </w:pPr>
       <w:r>
-        <w:t xml:space="preserve">Natural variation in food availability was measured three different ways, the cone production during the previous year, the spruce mast year status of the current year, and the mother’s spruce cone cache size from the previous year. To assess annual cone production, we used a standardized procedure (ref) where we used binoculars to count the number of new cones on around 100 spruce trees systematically distributed across each study are for each of the 7 study areas in in the late summer before squirrels started clipping and caching the cones (typically late July or early August) from 1989 to 2025. We log transformed the tree cone counts and took the average for every grid every year (REF LaMontagne and Boutin 2007). There were 4 cases where we did not quantify the spruce cone production on a study area in a given year. In such cases, we gave it the study area the average tree cone production of all the study areas measured that year. Based on cone count data, we categorized years as being</w:t>
+        <w:t xml:space="preserve">Natural variation in food availability was measured three different ways, the cone production during the previous year, the spruce mast year status of the current year, and the mother’s spruce cone cache size from the previous year. To assess annual cone production, we used a standardized procedure (REF) where we used binoculars to count the number of new cones on around 100 spruce trees systematically distributed across each study are for each of the 7 study areas in in the late summer before squirrels started clipping and caching the cones (typically late July or early August) from 1989 to 2025. We log transformed the tree cone counts and took the average for every study area every year (REF LaMontagne and Boutin 2007). There were 4 cases where we did not quantify the spruce cone production on a study area in a given year. In such cases, we gave it the study area the average tree cone production of all the study areas measured that year. Based on cone count data, we categorized years as being</w:t>
       </w:r>
       <w:r>
         <w:t xml:space="preserve"> </w:t>
@@ -121,7 +121,7 @@
         <w:pStyle w:val="BodyText"/>
       </w:pPr>
       <w:r>
-        <w:t xml:space="preserve">Food and density are inherently correlated with one another in this system (REF Dantzer et al., 2020). To test whether acoustic cues of higher squirrel densities without additional food affected the life history traits of squirrels, we experimentally manipulated acoustic densities of squirrels by exposing them to recordings of squirrel rattles on four study areas over six years. The playback experiments were conducted from 2018 to 2022 on one grid, in addition to a separate study in 2010 that occurred on three grids (Dantzer et al. 2013). On each grid, speakers were deployed at an average density of XX per ha and were programmed to play squirrel rattles every XX minutes. In total, 59 mothers and 65 litters were from rattle playback grids, while 147 mothers and 160 litters were from control grids during those same years (2010 and 2018-2022).</w:t>
+        <w:t xml:space="preserve">Food and density are inherently correlated with one another in this system (REF Dantzer et al., 2020). To test whether acoustic cues of higher squirrel densities without additional food affected the life history traits of squirrels, we experimentally manipulated acoustic densities of squirrels by exposing them to recordings of squirrel rattles on four study areas over six years. The playback experiments were conducted from 2018 to 2022 on one study area, in addition to a separate study in 2010 that occurred on three study areas (Dantzer et al. 2013). On rattle treatment area, speakers were deployed at an average density of XX per ha and were programmed to play squirrel rattles every XX minutes. In total, 59 mothers and 65 litters were from rattle playback areas, while 147 mothers and 160 litters were from control areas during those same years (2010 and 2018-2022).</w:t>
       </w:r>
     </w:p>
     <w:p>
@@ -137,15 +137,15 @@
         <w:pStyle w:val="BodyText"/>
       </w:pPr>
       <w:r>
-        <w:t xml:space="preserve">To estimate conspecific densities (squirrels/ha) that breeding females experienced, we identified the total number of squirrels defending a territory each spring in May of each year. A squirrel was considered the owner of a midden if it was regularly trapped there and displayed territorial behaviours while on the midden (e.g., rattles or caching spruce cones at the midden). Because squirrels are diurnal, visually/acoustically conspicuous, and easily live-trapped, we were able to completely enumerate all squirrels on the study areas. Occasionally, squirrels may own multiple middens; in these scenarios, we only used the squirrel’s primary midden, which was defined as the location where the squirrel most often occurred (observed or captured at that location) and where its spruce cone cache was located. In total, there were 12331 census records of 5128 known squirrels, across the 7 grids and over the 38 year study. There were 301 census records that had a known squirrel but were missing a location. In these cases, we used the average trapping location of that squirrel that spring (April - June) as their census location.</w:t>
-      </w:r>
-    </w:p>
-    <w:p>
-      <w:pPr>
-        <w:pStyle w:val="BodyText"/>
-      </w:pPr>
-      <w:r>
-        <w:t xml:space="preserve">To calculate local density for each mother, we counted how many squirrels resided within a 130 m radius of her midden location (see figure S1 for a visual example of real spatial locations) and divided this count by the circle area, or 5.3 hectares. We chose this 130 m radius as this is likely the farthest distance that squirrels can hear the territorial vocalizations of other squirrels (REF Smith, 1968, 1978) and it has proven to be an ecologically-relevant estimate of the acoustic neighborhood experienced red squirrels that influences their life history traits (REF Fisher et al., 2017; Siracusa et al., 2021). The edges of trapping grids naturally had lower squirrel densities because grids were surrounded by habitat unsuitable for squirrels, such as marshes, aspen forests, or the Alaska highway (REF Martinig et al. 2020). Therefore, we did not extrapolate squirrel densities outside of grid boundaries. Food supplementation caused an increase in local density over time.</w:t>
+        <w:t xml:space="preserve">To estimate conspecific densities (squirrels/ha) that breeding females experienced, we identified the total number of squirrels defending a territory each spring in May of each year. A squirrel was considered the owner of a midden if it was regularly trapped there and displayed territorial behaviours while on the midden (e.g., rattles or caching spruce cones at the midden). Because squirrels are diurnal, visually/acoustically conspicuous, and easily live-trapped, we were able to completely enumerate all squirrels on the study areas. Occasionally, squirrels may own multiple middens; in these scenarios, we only used the squirrel’s primary midden, which was defined as the location where the squirrel most often occurred (observed or captured at that location) and where its spruce cone cache was located. In total, there were 12331 census records of 5128 known squirrels, across the 7 study areas and over the 38 year study. There were 301 census records that had a known squirrel but were missing a location. In these cases, we used the average trapping location of that squirrel that spring (April - June) as their census location.</w:t>
+      </w:r>
+    </w:p>
+    <w:p>
+      <w:pPr>
+        <w:pStyle w:val="BodyText"/>
+      </w:pPr>
+      <w:r>
+        <w:t xml:space="preserve">To calculate local density for each mother, we counted how many squirrels resided within a 130 m radius of her midden location (see figure S1 for a visual example of real spatial locations) and divided this count by the circle area, or 5.3 hectares. We chose this 130 m radius as this is likely the farthest distance that squirrels can hear the territorial vocalizations of other squirrels (REF Smith, 1968, 1978) and it has proven to be an ecologically-relevant estimate of the acoustic neighborhood experienced red squirrels that influences their life history traits (REF Fisher et al., 2017; Siracusa et al., 2021). The edges of trapping areas naturally had lower squirrel densities because study areas were surrounded by habitat unsuitable for squirrels, such as marshes, aspen forests, or the Alaska highway (REF Martinig et al. 2020). Therefore, we did not extrapolate squirrel densities outside of study area boundaries. Food supplementation caused an increase in local density over time.</w:t>
       </w:r>
     </w:p>
     <w:p>
@@ -161,7 +161,7 @@
         <w:pStyle w:val="BodyText"/>
       </w:pPr>
       <w:r>
-        <w:t xml:space="preserve">All data cleaning and statistical analyses were conducted using R language software (REF version). We standardized all numeric variables to have a mean of zero and a standard deviation of 1. Local density, spruce cone production, cache size, and mother age were all standardized across all years and all grids. Litter size, litter growth rate, and Julian birth date were standardized within grid-year to be consistent with other studies (REF McAdam et al., 2019, etc.). Using the standardized cache size data, we categorized litters into three levels: small (&lt; 25% quantile), medium (&gt; 25% and &lt; 75% quantile), and large (&gt; 75% quantile). Years were categorized as either mast years or non-mast years, as indicated above. We categorized litters into one of four treatment groups: 1) controls, 2) high density with supplemental food food (henceforth,</w:t>
+        <w:t xml:space="preserve">All data cleaning and statistical analyses were conducted using R language software (REF version). We standardized all numeric variables to have a mean of zero and a standard deviation of 1. Local density, spruce cone production, cache size, and mother age were all standardized across all years and all study areas (i.e., grids). Litter size, litter growth rate, and Julian birth date were standardized within grid-year to be consistent with other studies (REF McAdam et al., 2019, etc.). Using the standardized cache size data, we categorized litters into three levels: small (&lt; 25% quantile), medium (&gt; 25% and &lt; 75% quantile), and large (&gt; 75% quantile). Years were categorized as either mast years or non-mast years, as indicated above. We categorized litters into one of four treatment groups: 1) controls, 2) high density with supplemental food food (henceforth,</w:t>
       </w:r>
       <w:r>
         <w:t xml:space="preserve"> </w:t>
@@ -179,15 +179,15 @@
         <w:t xml:space="preserve">‘no bucket’</w:t>
       </w:r>
       <w:r>
-        <w:t xml:space="preserve">), and high acoustic density (henceforth, ‘rattle’).</w:t>
-      </w:r>
-    </w:p>
-    <w:p>
-      <w:pPr>
-        <w:pStyle w:val="BodyText"/>
-      </w:pPr>
-      <w:r>
-        <w:t xml:space="preserve">We used a multivariate Bayesian approach to test how food availability and perceived density influence the relationship between litter size and growth rate in response to con-specific density. To coherently meet the objectives of this study, we conducted three separate multivariate Bayesian models using the ‘brms’ package (cite). Using the bf() function, we created two model formulas per analysis, one for each response variable, i.e., litter size and litter growth rate. We ran the models using the brm() function, merging both models into a bivariate analysis using the</w:t>
+        <w:t xml:space="preserve">), and high acoustic density (henceforth, ‘rattle’). See Table 1 for a summary of sample sizes by these categories and years.</w:t>
+      </w:r>
+    </w:p>
+    <w:p>
+      <w:pPr>
+        <w:pStyle w:val="BodyText"/>
+      </w:pPr>
+      <w:r>
+        <w:t xml:space="preserve">We used a multivariate Bayesian approach to test how food availability, density, perceived density influence the relationship between litter size and growth rate. To coherently meet the objectives of this study, we conducted four separate multivariate Bayesian models using the ‘brms’ package (cite). Using the bf() function, we created two model formulas per analysis, one for each response variable, i.e., litter size and litter growth rate. We ran the models using the brm() function, merging both models into a bivariate analysis using the</w:t>
       </w:r>
       <w:r>
         <w:t xml:space="preserve"> </w:t>
@@ -207,7 +207,7 @@
         <w:pStyle w:val="BodyText"/>
       </w:pPr>
       <w:r>
-        <w:t xml:space="preserve">The first analysis, called the</w:t>
+        <w:t xml:space="preserve">Our study used four model designs. In the first analysis, we investigated how natural variation in local density affected the covariance between litter size and growth rate. This model, the</w:t>
       </w:r>
       <w:r>
         <w:t xml:space="preserve"> </w:t>
@@ -216,32 +216,16 @@
         <w:t xml:space="preserve">‘Control Model’</w:t>
       </w:r>
       <w:r>
-        <w:t xml:space="preserve">, tested how, under natural food and natural density conditions, the relationship between litter size and litter growth rate is affected by local density. The control model used litters from control grids (KL and SU) across all years of the long-term study (1989 - 2025) and included all fixed and random effects listed above.</w:t>
-      </w:r>
-    </w:p>
-    <w:p>
-      <w:pPr>
-        <w:pStyle w:val="BodyText"/>
-      </w:pPr>
-      <w:r>
-        <w:t xml:space="preserve">The second analysis, called the</w:t>
+        <w:t xml:space="preserve">, used litters from control study areas (KL and SU) across all years of the long-term study (1989 - 2025) and included all fixed and random effects listed above. Next, we investigated how experimentally increasing density (food add areas) with or without food (bucket vs. no bucket) affected the covariance between litter size and growth rate in comparison to natural conditions (control areas). This model, called the</w:t>
       </w:r>
       <w:r>
         <w:t xml:space="preserve"> </w:t>
       </w:r>
       <w:r>
-        <w:t xml:space="preserve">‘Food Model’</w:t>
-      </w:r>
-      <w:r>
-        <w:t xml:space="preserve">, tested how food supplementation affected the relationship between litter size and growth rates in response to density. The Food Model used litters from control and food add grids across all years of the food add experiment (2005 to 2017, n = 1260). This data set therefore had three individual treatment groups: control, bucket, and no bucket. We interacted food treatment with density.</w:t>
-      </w:r>
-    </w:p>
-    <w:p>
-      <w:pPr>
-        <w:pStyle w:val="BodyText"/>
-      </w:pPr>
-      <w:r>
-        <w:t xml:space="preserve">The third analysis, called the</w:t>
+        <w:t xml:space="preserve">“Food Model”</w:t>
+      </w:r>
+      <w:r>
+        <w:t xml:space="preserve">, used litters from control and food add study areas across all years of the food add experiment (2005 to 2017, n = 1260). This data set therefore had three individual treatment groups: control, bucket, and no bucket. We interacted food treatment with density. Thirdly, in the</w:t>
       </w:r>
       <w:r>
         <w:t xml:space="preserve"> </w:t>
@@ -250,15 +234,7 @@
         <w:t xml:space="preserve">‘Cache Model’</w:t>
       </w:r>
       <w:r>
-        <w:t xml:space="preserve">, tested how the mother’s categorized cache size (3 levels) affected the relationship between litter size and growth rates in response to density. The Cache Model used litters from control grids during years when midden cones were counted (2008 to 2025, n = 457). We interacted cache size with density. No other fixed effects interacted.</w:t>
-      </w:r>
-    </w:p>
-    <w:p>
-      <w:pPr>
-        <w:pStyle w:val="BodyText"/>
-      </w:pPr>
-      <w:r>
-        <w:t xml:space="preserve">The fourth and final analysis, called the</w:t>
+        <w:t xml:space="preserve">, we tested how individual food availability (cache size) under natural food and density conditions (control areas) affected the covariance. The Cache Model used litters from control areas during years when midden cones were counted (2008 to 2025, n = 457). We interacted the mother’s previous autumn’s cache size with local density. Finally, in the</w:t>
       </w:r>
       <w:r>
         <w:t xml:space="preserve"> </w:t>
@@ -267,7 +243,10 @@
         <w:t xml:space="preserve">‘Rattle Model’</w:t>
       </w:r>
       <w:r>
-        <w:t xml:space="preserve">, tested how changes in perceived density, via rattle playbacks, affected the relationship between litter size and growth rates in response to density. The Rattle Model used litters from control and rattle grids during years when playback experiments occurred (2010 and 2010 to 2022, n = 236). This data set therefore had two treatments: rattles and controls. We interacted treatment with density. No other fixed effects interacted.</w:t>
+        <w:t xml:space="preserve"> </w:t>
+      </w:r>
+      <w:r>
+        <w:t xml:space="preserve">we investigated how increasing social cues of density affected the covariance between litter size and growth rate using the rattle playback experiments. The Rattle Model used litters from control and rattle study areas during years when playback experiments occurred (2010 and 2010 to 2022, n = 236). This data set therefore had two treatments: rattles and controls. We interacted treatment with density.</w:t>
       </w:r>
     </w:p>
     <w:p>

</xml_diff>

<commit_message>
add in Ben's methods and edits
</commit_message>
<xml_diff>
--- a/Methods.docx
+++ b/Methods.docx
@@ -31,55 +31,47 @@
         <w:pStyle w:val="FirstParagraph"/>
       </w:pPr>
       <w:r>
-        <w:t xml:space="preserve">Reproductive Outcomes</w:t>
-      </w:r>
-    </w:p>
-    <w:p>
-      <w:pPr>
-        <w:pStyle w:val="BodyText"/>
-      </w:pPr>
-      <w:r>
-        <w:t xml:space="preserve">Every spring from 1989 to 2025, we trapped female squirrels repeatedly during pregnancy to palpate them and track their pregnancies up to and following gestation. When pregnant females were estimated to be within five days of their parturition date, we fitted them with a very high frequency (VHF) radio collar. Once post-partum (parturition identified by large body mass loss or expressing milk from nipples), using the VHF collar, we tracked the female to her nest. We extracted the pups from the nest to determine litter size, and individual sex and weight. We weighed individual pups to the nearest 0.1 g and gave them a unique ear notch to later identify them within the litter and collect a tissue sample for subsequent DNA parentage analyses (REF). Approximately 25 days after the first visit, we re-located the nest and retrieved the pups. Now developed enough, we ear tagged the pups with unique identification codes and weighed them again to the nearest 0.1 g. To calculate juvenile growth rate, we subtracted the weight at the first visit from the weight at the second weight and divided the difference by the number of days in between visits. Juvenile growth during this time period is linear (REF McAdam &amp; Boutin, 2003 J Evol Biol). SOme litters did not survive to the second nest entry, so we could not obtain growth rates for all litters. For this analysis we only used data from a mother’s first litter on a given year to be consistent with previous studies (REF). We removed cases where the number of days in between weight measurements was less than 5, the first weight was greater than 50 g, or the second weight was greater than 100 g because these are characteristics of instances when a nest was initially sampled too late after parturition to be compared. We then averaged the growth rates for each litter so that each female had only one litter averaged growth rate per year.</w:t>
-      </w:r>
-    </w:p>
-    <w:p>
-      <w:pPr>
-        <w:pStyle w:val="BodyText"/>
-      </w:pPr>
-      <w:r>
-        <w:t xml:space="preserve">We had a total sample size of 2064 litters from 1245 mothers collected from squirrels on two adjacent study areas from 1989-2025. We also collected the parturition dates of all litters because litters born later in the year are usually smaller in size and growth rate (REF). If a litter’s parturition date was unknown (n = 91), e.g., the first nest visit occurred later than normal, we estimated it by subtracting the number of days from the first nest visit to when the pup size would have been the average birth weight of 8 g via the average growth rate of 1.8 g per day (i.e., birth date = date 1 - (weight 1 - 8)/1.8) (REF). Mother age and birth year can also influence life history outcomes (REF). Therefore, we also collected the mothers’ birth years from the study’s birth record data. If a mother’s birth year was unknown (n = 482 out of 1245 total mothers), i.e., we do not have a birth record of the mother, we assumed it to be the year before she was first entered into the study. The final life history measurements were litter size, litter growth rate, litter sex ratio (proportion being male), litter parturition date (Julian Day), mother age (years), and mother birth year.</w:t>
-      </w:r>
-    </w:p>
-    <w:p>
-      <w:pPr>
-        <w:pStyle w:val="BodyText"/>
-      </w:pPr>
-      <w:r>
-        <w:t xml:space="preserve">Food Add Experiment</w:t>
-      </w:r>
-    </w:p>
-    <w:p>
-      <w:pPr>
-        <w:pStyle w:val="BodyText"/>
-      </w:pPr>
-      <w:r>
-        <w:t xml:space="preserve">Food supplementation (i.e., food add) occurred on three separate areas (LL, JO, AG) that were distant from the other two control study areas (KL/SU). Food add experiments started in the Autumn of 2005 and continued until Spring of 2017, though the exact start and end dates of the food supplementation varied by study area (Table 1). Within the food add areas, buckets containing approximately 1 KG of peanut butter were distributed to squirrel middens randomly. These buckets were restocked with peanut butter approximately every 6 weeks from autumn to spring and/or until females were no longer lactating to the food add as close to ad libitum as possible. Natural defensive behaviour by squirrels ensured that buckets were only accessed by the owners of the midden (REF van Kesteren et al. 2019 PBZ). In total, 432 mothers and 707 litters were from food add areas, with 319 mothers and 479 litters being from middens with buckets. The remainder were from food add areas but did not receive direct food supplementation.</w:t>
-      </w:r>
-    </w:p>
-    <w:p>
-      <w:pPr>
-        <w:pStyle w:val="BodyText"/>
-      </w:pPr>
-      <w:r>
-        <w:t xml:space="preserve">Food Availability Estimates</w:t>
-      </w:r>
-    </w:p>
-    <w:p>
-      <w:pPr>
-        <w:pStyle w:val="BodyText"/>
-      </w:pPr>
-      <w:r>
-        <w:t xml:space="preserve">Natural variation in food availability was measured three different ways, the cone production during the previous year, the spruce mast year status of the current year, and the mother’s spruce cone cache size from the previous year. To assess annual cone production, we used a standardized procedure (REF) where we used binoculars to count the number of new cones on around 100 spruce trees systematically distributed across each study are for each of the 7 study areas in in the late summer before squirrels started clipping and caching the cones (typically late July or early August) from 1989 to 2025. We log transformed the tree cone counts and took the average for every study area every year (REF LaMontagne and Boutin 2007). There were 4 cases where we did not quantify the spruce cone production on a study area in a given year. In such cases, we gave it the study area the average tree cone production of all the study areas measured that year. Based on cone count data, we categorized years as being</w:t>
+        <w:t xml:space="preserve">Female life history data collection</w:t>
+      </w:r>
+    </w:p>
+    <w:p>
+      <w:pPr>
+        <w:pStyle w:val="BodyText"/>
+      </w:pPr>
+      <w:r>
+        <w:t xml:space="preserve">Red squirrels are polygamous with a scramble competition mating system and females are thought to be spontaneous ovulators (Lane et al., 2009). The timing of estrous at our study site is variable and depends upon squirrel densities and spruce cone production in the previous year (Boutin et al., 2006; McAdam et al., 2019; Dantzer et al., 2020). Females typically produce one successful litter in each year except in spruce mast years (Boutin et al., 2006), although if the first litter fails in a non-mast or mast year, females will often attempt a second litter.</w:t>
+      </w:r>
+    </w:p>
+    <w:p>
+      <w:pPr>
+        <w:pStyle w:val="BodyText"/>
+      </w:pPr>
+      <w:r>
+        <w:t xml:space="preserve">To monitor female reproduction, we live-trapped females prior to and during pregnancy to palpate their abdomens (to detect fetuses) and track their pregnancies through lactation (Dantzer et al., 2020). When pregnant females were estimated to be within five days of their parturition date or when they were lactating, we fitted them with a very high frequency (VHF) radio collar. Once post-partum (parturition identified by large body mass loss or expressing milk from nipples), using the VHF collar, we tracked the female to her nest. We extracted the pups from the nest to determine litter size, and individual sex and weight. We weighed individual pups to the nearest 0.1 g and gave them a unique ear notch to later identify them within the litter and collect a tissue sample for subsequent DNA parentage analyses (REF Gunn et al., 2005). Approximately 25 days after the first visit, we re-located the nest and retrieved the pups. Now developed enough, we ear tagged the pups with uniquely labeled metal ear tags and weighed them again to the nearest 0.1 g. To calculate juvenile growth rate, we subtracted the weight at the first visit from the weight at the second weight and divided the difference by the number of days in between visits. Juvenile growth during this time period is linear (REF McAdam &amp; Boutin, 2003 J Evol Biol). Some litters did not survive to the second nest entry, so we could not obtain growth rates for all litters. For this analysis we only used data from a mother’s first litter on a given year to be consistent with previous studies (REF e.g., Dantzer et al., 2013; McAdam et al., 2019; Petrullo et al., 2023). We removed cases where the number of days in between weight measurements was less than 5, the first weight was greater than 50 g, or the second weight was greater than 100 g because these are characteristics of instances when a nest was initially sampled too late after parturition to be compared (REF Fisher et al., 2017). The final life history data we used in our analyses were litter parturition date (Julian Day), litter size, litter average growth rate, and litter sex ratio (proportion pups being male).</w:t>
+      </w:r>
+    </w:p>
+    <w:p>
+      <w:pPr>
+        <w:pStyle w:val="BodyText"/>
+      </w:pPr>
+      <w:r>
+        <w:t xml:space="preserve">We had a total sample size of 1198 litters from 698 mothers collected from squirrels on two adjacent study areas from 1989-2025. We also collected the parturition dates of all litters because litters born later in the year are usually smaller in size and exhibit a slower growth rate (REF). If a litter’s parturition date was unknown (n = 60 litters), e.g., the first nest visit occurred later than normal, we estimated it by subtracting the number of days from the first nest visit to when the pup size would have been the average birth weight of 8 g via the average growth rate of 1.8 g per day (i.e., birth date = date 1 - (weight 1 - 8)/1.8) (REF). Mother age and birth year can also influence life history outcomes (REF). Therefore, we also collected the mothers’ birth years from the study’s birth record data. If a mother’s birth year was unknown (n = 251 out of 698 total mothers), i.e., we do not have a birth record of the mother, we assumed it to be the year before she was first entered into the study.</w:t>
+      </w:r>
+    </w:p>
+    <w:p>
+      <w:pPr>
+        <w:pStyle w:val="BodyText"/>
+      </w:pPr>
+      <w:r>
+        <w:t xml:space="preserve">Estimates of environmental- and individual-level food availability</w:t>
+      </w:r>
+    </w:p>
+    <w:p>
+      <w:pPr>
+        <w:pStyle w:val="BodyText"/>
+      </w:pPr>
+      <w:r>
+        <w:t xml:space="preserve">We assessed the effects of food availability on the co-variance between litter size and offspring growth using 1) environmental (ambient) measures of spruce cone production by counting spruce cones on trees in the late summer of each year from 1989 - 2025 and 2) estimating the number of spruce cones cached underground by individual squirrels in the autumn of each year from 2008 - 2025. To assess annual cone production, we used a standardized procedure (REF) where we used binoculars to count the number of newly mature cones on around 100 spruce trees systematically distributed across each study area for each of the 7 study areas in the late summer before squirrels started clipping and caching the cones (typically late July or early August). We log transformed the tree cone counts and took the average for every study area every year (REF LaMontagne and Boutin 2007). There were 4 study area-year combinations which did not have spruce cone production assessments. In such cases, we gave those study areas the average tree cone production of all the study areas measured that year. Based on cone count data, we categorized years as being</w:t>
       </w:r>
       <w:r>
         <w:t xml:space="preserve"> </w:t>
@@ -97,31 +89,80 @@
         <w:t xml:space="preserve">‘mast years’</w:t>
       </w:r>
       <w:r>
-        <w:t xml:space="preserve">, when there were an exponentially high amount of cones produced that autumn (stat?). Over the course of this long-term study, we categorized 1993, 1998, 2005, 2010, 2014, 2019, 2022 as mast years.</w:t>
-      </w:r>
-    </w:p>
-    <w:p>
-      <w:pPr>
-        <w:pStyle w:val="BodyText"/>
-      </w:pPr>
-      <w:r>
-        <w:t xml:space="preserve">To assess spruce cone cache sizes of individual squirrels, we used a standardized method to count the number of cones cached on middens owned by squirrels on the two control study areas (KL/SU) each September starting in 2007 (probably needs more detail, REF Haines et al. 2022). We log transformed the cached cone counts and paired them to litters born the year following a mother’s midden cone count. In total, 454 litters from 283 females had associated cache sizes.</w:t>
-      </w:r>
-    </w:p>
-    <w:p>
-      <w:pPr>
-        <w:pStyle w:val="BodyText"/>
-      </w:pPr>
-      <w:r>
-        <w:t xml:space="preserve">Rattle Playback Experiment</w:t>
-      </w:r>
-    </w:p>
-    <w:p>
-      <w:pPr>
-        <w:pStyle w:val="BodyText"/>
-      </w:pPr>
-      <w:r>
-        <w:t xml:space="preserve">Food and density are inherently correlated with one another in this system (REF Dantzer et al., 2020). To test whether acoustic cues of higher squirrel densities without additional food affected the life history traits of squirrels, we experimentally manipulated acoustic densities of squirrels by exposing them to recordings of squirrel rattles on four study areas over six years. The playback experiments were conducted from 2018 to 2022 on one study area, in addition to a separate study in 2010 that occurred on three study areas (Dantzer et al. 2013). On rattle treatment area, speakers were deployed at an average density of XX per ha and were programmed to play squirrel rattles every XX minutes. In total, 60 mothers and 66 litters were from rattle playback areas, while 135 mothers and 148 litters were from control areas during those same years (2010 and 2018-2022).</w:t>
+        <w:t xml:space="preserve">, when there were an exponentially high amount of cones produced that autumn. Over the course of this long-term study, we categorized 1993, 1998, 2005, 2010, 2014, 2019, 2022 as mast years. In non-mast years, average cone production was 20 cones/tree, while in mast years it was 330 cones/tree.</w:t>
+      </w:r>
+    </w:p>
+    <w:p>
+      <w:pPr>
+        <w:pStyle w:val="BodyText"/>
+      </w:pPr>
+      <w:r>
+        <w:t xml:space="preserve">To assess spruce cone cache sizes of individual squirrels, we used a standardized method to count the number of cones cached on middens owned by squirrels on the two control study areas (KL/SU) each September starting in 2007 (ADD DETAILS, REF Haines et al. 2022). We log transformed the cached cone counts and paired them to litters born the year following a mother’s midden cone count. In total, 454 litters from 283 females had associated cache sizes.</w:t>
+      </w:r>
+    </w:p>
+    <w:p>
+      <w:pPr>
+        <w:pStyle w:val="BodyText"/>
+      </w:pPr>
+      <w:r>
+        <w:t xml:space="preserve">Density manipulation using long-term food supplementation</w:t>
+      </w:r>
+    </w:p>
+    <w:p>
+      <w:pPr>
+        <w:pStyle w:val="BodyText"/>
+      </w:pPr>
+      <w:r>
+        <w:t xml:space="preserve">We experimentally increased actual squirrel densities using long-term food supplementation (i.e., food add) on three separate study areas (AG, JO, LL) that were distant from the other two control study areas (KL/SU). Food supplementation started in the Autumn of 2005 and continued until Spring of 2017, though the exact start and end dates of the food supplementation varied by study area (Table 1). To provide food supplementation to individual squirrels, we hung a bucket containing approximately 1 KG of all natural peanut butter (no salt or sugar added) between two trees at the center of middens. Squirrels readily consume peanut butter but are unable to cache it underground. Peanut butter was restocked approximately every 6 weeks from autumn to spring and/or until females were no longer lactating to the food add as close to ad libitum as possible. Territorial behavior by squirrels ensured that buckets were only accessed by the owners of the midden (REF van Kesteren et al. 2019 PBZ), allowing us to perform an individual food supplementation experiment. As densities on the food-add grids increased over time (Fig. X), some squirrels established new middens without buckets or supplemental food. This provided us with an opportunity to examine how increased density (caused by long-term food supplementation) with or without access to additional food affected their life history traits. In total, we monitored the effects of increased density and supplemental food on litter size and growth rate from 479 litters from 319 mothers and the effects of increased density without access to supplemental food from 228 litters from 185 females.</w:t>
+      </w:r>
+    </w:p>
+    <w:p>
+      <w:pPr>
+        <w:pStyle w:val="BodyText"/>
+      </w:pPr>
+      <w:r>
+        <w:t xml:space="preserve">Acoustic density manipulation</w:t>
+      </w:r>
+    </w:p>
+    <w:p>
+      <w:pPr>
+        <w:pStyle w:val="BodyText"/>
+      </w:pPr>
+      <w:r>
+        <w:t xml:space="preserve">Food and density are inherently correlated with one another in this system (REF Dantzer et al., 2020). To test whether acoustic cues of higher squirrel densities without additional food affected the life history traits of squirrels, we experimentally manipulated acoustic densities of squirrels by exposing them to recordings of squirrel rattles on four study areas over six years. We have previously shown that these acoustic playbacks of rattles influence the behavioral and life history traits of squirrels (REF Dantzer et al., 2012, 2013). The playback experiments were conducted from 2018 to 2022 on two study areas (JO/BT), in addition to a separate study in 2010 that occurred on three separate study areas (AG/BT/LL) that we have previously published (REF Dantzer et al. 2013). Squirrels were exposed to either rattle playbacks (2010, 2018 - 2022) or, in some years, boreal chickadee (Poecile hudsonicus) playbacks as a control (2010, 2018 - 2021). We chose boreal chickadee vocalizations as a control stimulus because they are a year-round resident on our study areas that is not known to be a predatory species of red squirrels. Playback speakers turned on at dawn and turned off at dusk and were adjusted so that they broadcast a chickadee call or rattle approximately every 7 min. This was because our previous studies (REF Dantzer et al., 2012; Siracusa et al.) suggest that squirrels emit rattles approximately once every 7-10 min during the active part of their day. Sound pressure levels of the speakers were standardized to broadcast a call at 100 dB from 1 m away from the speaker by using a sound pressure meter (Radio Shack Digital Sound Level Meter #33-2055).</w:t>
+      </w:r>
+    </w:p>
+    <w:p>
+      <w:pPr>
+        <w:pStyle w:val="BodyText"/>
+      </w:pPr>
+      <w:r>
+        <w:t xml:space="preserve">Rattles contain individually distinct signatures, which allowed us to increase the number of unique rattles that females heard during reproduction. We simulated an increase of 4 additional neighboring squirrels by exposing them to audio playbacks of rattles recorded from 4 different squirrels (i.e., each playback speaker played back 4 rattles from 2 females and 2 males). We exposed other squirrels to 4 different chickadee vocalizations. We used x different rattle recordings and x different chickadee recordings (i.e., we did not use the same recordings at each speaker), with each speaker broadcasting a unique combination of rattles or chickadee laybacks. Rattles used in the playbacks were recorded from squirrels that were unknown to treated squirrels as they were recorded &gt;500 m away from the study areas used in this experiment. Methods for recording the rattles are discussed elsewhere (10, 45). We used publicly available recordings of boreal chickadee vocalizations from different commercial sources (www.xenocanto.org, Cornell Lab of Ornithology) to develop 17 unique combinations of 4 chickadee vocalizations.</w:t>
+      </w:r>
+      <w:r>
+        <w:t xml:space="preserve"> </w:t>
+      </w:r>
+      <w:r>
+        <w:t xml:space="preserve">Playback treatments were deployed in one of two ways. In 2010, we treated individual females with playback treatments, setting up two speakers at the periphery (placed in random cardinal direction, ~15 m away from the center of the midden) of their territory as soon as they were confirmed to be pregnant (mid-gestation) and until 5 days post-parturition (approximately 34 continuous days). In this year, some females on the same study area were treated with either rattle or chickadee playbacks, with the restriction that females exposed to chickadee playbacks had to be &gt;150 m away from a squirrel exposed to rattle playbacks. We did this to attempt to make the chickadee playback females out of hearing distance of the rattle playbacks (30, 45). Squirrel or chickadee playbacks were broadcast from an MP3 player (Coby MP-300, Lake Success, NY, USA) through two separate speakers (two different alternating vocalizations were broadcast through each speaker: Altec Lansing Orbit, San Diego, CA, USA).</w:t>
+      </w:r>
+    </w:p>
+    <w:p>
+      <w:pPr>
+        <w:pStyle w:val="SourceCode"/>
+      </w:pPr>
+      <w:r>
+        <w:rPr>
+          <w:rStyle w:val="VerbatimChar"/>
+        </w:rPr>
+        <w:t xml:space="preserve">In other years (2018-2022), we set up bespoke speakers that automatically turned on and off at dusk/dawn. Instead of placing these speakers around female middens as we did in 2010, we placed speakers at specific locations on our study areas (see map of speakers: Fig x). Speakers on some study areas only broadcast rattle playbacks whereas other study areas in some years only had chickadee playbacks. As such, some study areas were “rattle treatments” and others were “playback treatments”. </w:t>
+      </w:r>
+    </w:p>
+    <w:p>
+      <w:pPr>
+        <w:pStyle w:val="FirstParagraph"/>
+      </w:pPr>
+      <w:r>
+        <w:t xml:space="preserve">Below we describe how we ended up combining the chickadee females and true control females (not exposed to any playback) because there were no differences in life history traits between chickadee playback and true control females (REF Dantzer et al., 2013). In total, 66 litters from 60 females were from rattle playback areas, 24 litters from 24 females experienced chickadee playbacks, and 148 litters from 135 females were from control areas during those same years.</w:t>
       </w:r>
     </w:p>
     <w:p>
@@ -137,15 +178,23 @@
         <w:pStyle w:val="BodyText"/>
       </w:pPr>
       <w:r>
-        <w:t xml:space="preserve">To estimate conspecific densities (squirrels/ha) that breeding females experienced, we identified the total number of squirrels defending a territory each spring in May of each year. A squirrel was considered the owner of a midden if it was regularly trapped there and displayed territorial behaviours while on the midden (e.g., rattles or caching spruce cones at the midden). Because squirrels are diurnal, visually/acoustically conspicuous, and easily live-trapped, we were able to completely enumerate all squirrels on the study areas. Occasionally, squirrels may own multiple middens; in these scenarios, we only used the squirrel’s primary midden, which was defined as the location where the squirrel most often occurred (observed or captured at that location) and where its spruce cone cache was located. In total, there were 12331 census records of 5128 known squirrels, across the 7 study areas and over the 38 year study. There were 301 census records that had a known squirrel but were missing a location. In these cases, we used the average trapping location of that squirrel that spring (April - June) as their census location.</w:t>
-      </w:r>
-    </w:p>
-    <w:p>
-      <w:pPr>
-        <w:pStyle w:val="BodyText"/>
-      </w:pPr>
-      <w:r>
-        <w:t xml:space="preserve">To calculate local density for each mother, we counted how many squirrels resided within a 130 m radius of her midden location (see figure S1 for a visual example of real spatial locations) and divided this count by the circle area, or 5.3 hectares. We chose this 130 m radius as this is likely the farthest distance that squirrels can hear the territorial vocalizations of other squirrels (REF Smith, 1968, 1978) and it has proven to be an ecologically-relevant estimate of the acoustic neighborhood experienced red squirrels that influences their life history traits (REF Fisher et al., 2017; Siracusa et al., 2021). The edges of trapping areas naturally had lower squirrel densities because study areas were surrounded by habitat unsuitable for squirrels, such as marshes, aspen forests, or the Alaska highway (REF Martinig et al. 2020). Therefore, we did not extrapolate squirrel densities outside of study area boundaries. Food supplementation caused an increase in local density over time.</w:t>
+        <w:t xml:space="preserve">To estimate conspecific densities (squirrels/ha) that breeding females experienced, we identified the total number of squirrels defending a territory each spring in May of each year. A squirrel was considered the owner of a midden if it was regularly trapped there and displayed territorial behaviours while on the midden (e.g., rattles or caching spruce cones). Because squirrels are diurnal, visually/acoustically conspicuous, and easily live-trapped, we were able to completely enumerate all squirrels on the study areas. Occasionally, squirrels may own multiple middens; in these scenarios, we only used the squirrel’s primary midden, which was defined as the location where the squirrel most often occurred (observed or captured at that location) and where its spruce cone cache was located. In total, there were 12331 census records of 5128 known squirrels, across the 7 study areas and over the 38 year study. There were 301 census records that had a known squirrel but were missing a location. In these cases, we used the average coordinates of the locations where the squirrel was trapped that spring (April - June) as their census location.</w:t>
+      </w:r>
+    </w:p>
+    <w:p>
+      <w:pPr>
+        <w:pStyle w:val="BodyText"/>
+      </w:pPr>
+      <w:r>
+        <w:t xml:space="preserve">To calculate local density for each mother, we counted how many squirrels resided within a 130 m radius of her midden location (see figure S1 for a visual example of real spatial locations) and divided this count by the circle area, or 5.3 hectares. We chose this 130 m radius as this is likely the farthest distance that squirrels can hear the territorial vocalizations of other squirrels (REF Smith, 1968, 1978) and it has proven to be an ecologically-relevant estimate of the acoustic neighborhood experienced red squirrels that influences their behavioural or life history traits (REF Dantzer et al., 2012; Fisher et al., 2017; Siracusa et al., 2021). The edges of trapping areas naturally had lower squirrel densities because study areas were surrounded by habitat unsuitable for squirrels, such as marshes, aspen forests, or the Alaska highway (REF Martinig et al. 2020). Therefore, we did not extrapolate squirrel densities outside of study area boundaries. Food supplementation caused an increase in local density over time.</w:t>
+      </w:r>
+    </w:p>
+    <w:p>
+      <w:pPr>
+        <w:pStyle w:val="BodyText"/>
+      </w:pPr>
+      <w:r>
+        <w:t xml:space="preserve">Anticipated increases in density caused of food supplementation were reflected by this estimate for local density. In 2005, when food supplementation began, average local densities were similar between control grids (1.1 ± 0.4 squirrels/ha) and food supplemented grids (1.3 ± 0.4 squirrels/ha). By 2008, local densities of food supplemented areas increased and were 1.4 squirrels/ha higher than those of control areas, and they were 0.39 squirrels/ha higher on average for the entirety of the food supplementation experiment (Figure X).</w:t>
       </w:r>
     </w:p>
     <w:p>

</xml_diff>